<commit_message>
Final changes for verification
</commit_message>
<xml_diff>
--- a/ping_and_traceroute_report.docx
+++ b/ping_and_traceroute_report.docx
@@ -81,47 +81,7 @@
           <w:sz w:val="26"/>
           <w:szCs w:val="26"/>
         </w:rPr>
-        <w:t>my_ping</w:t>
-      </w:r>
-      <w:r>
-        <w:rPr>
-          <w:i/>
-          <w:iCs/>
-          <w:color w:val="808080"/>
-          <w:sz w:val="26"/>
-          <w:szCs w:val="26"/>
-        </w:rPr>
-        <w:t>.py</w:t>
-      </w:r>
-      <w:r>
-        <w:rPr>
-          <w:i/>
-          <w:iCs/>
-          <w:color w:val="808080"/>
-          <w:sz w:val="26"/>
-          <w:szCs w:val="26"/>
-        </w:rPr>
-        <w:t xml:space="preserve"> and my_traceroute.py</w:t>
-      </w:r>
-      <w:r>
-        <w:rPr>
-          <w:i/>
-          <w:iCs/>
-          <w:color w:val="808080"/>
-          <w:sz w:val="26"/>
-          <w:szCs w:val="26"/>
-        </w:rPr>
-        <w:t xml:space="preserve"> — </w:t>
-      </w:r>
-      <w:r>
-        <w:rPr>
-          <w:i/>
-          <w:iCs/>
-          <w:color w:val="808080"/>
-          <w:sz w:val="26"/>
-          <w:szCs w:val="26"/>
-        </w:rPr>
-        <w:t>Performing basic ping and traceroute actions</w:t>
+        <w:t>my_ping.py and my_traceroute.py — Performing basic ping and traceroute actions</w:t>
       </w:r>
     </w:p>
     <w:p>
@@ -509,8 +469,9 @@
           <w:sz w:val="21"/>
           <w:szCs w:val="21"/>
         </w:rPr>
-        <w:t>re run from the command line</w:t>
-      </w:r>
+        <w:t>re run from the command line, with additional runs using the -c, -</w:t>
+      </w:r>
+      <w:proofErr w:type="spellStart"/>
       <w:r>
         <w:rPr>
           <w:rFonts w:ascii="Times New Roman" w:hAnsi="Times New Roman" w:cs="Times New Roman"/>
@@ -518,8 +479,9 @@
           <w:sz w:val="21"/>
           <w:szCs w:val="21"/>
         </w:rPr>
-        <w:t xml:space="preserve"> </w:t>
-      </w:r>
+        <w:t>i</w:t>
+      </w:r>
+      <w:proofErr w:type="spellEnd"/>
       <w:r>
         <w:rPr>
           <w:rFonts w:ascii="Times New Roman" w:hAnsi="Times New Roman" w:cs="Times New Roman"/>
@@ -527,9 +489,8 @@
           <w:sz w:val="21"/>
           <w:szCs w:val="21"/>
         </w:rPr>
-        <w:t>), with additional runs using the -c, -</w:t>
-      </w:r>
-      <w:proofErr w:type="spellStart"/>
+        <w:t>, -s</w:t>
+      </w:r>
       <w:r>
         <w:rPr>
           <w:rFonts w:ascii="Times New Roman" w:hAnsi="Times New Roman" w:cs="Times New Roman"/>
@@ -537,9 +498,8 @@
           <w:sz w:val="21"/>
           <w:szCs w:val="21"/>
         </w:rPr>
-        <w:t>i</w:t>
-      </w:r>
-      <w:proofErr w:type="spellEnd"/>
+        <w:t>,</w:t>
+      </w:r>
       <w:r>
         <w:rPr>
           <w:rFonts w:ascii="Times New Roman" w:hAnsi="Times New Roman" w:cs="Times New Roman"/>
@@ -547,7 +507,25 @@
           <w:sz w:val="21"/>
           <w:szCs w:val="21"/>
         </w:rPr>
-        <w:t>, -s and -t options for ping and the -n, -q and -S options for traceroute to verify packet matching, timeout handling, and output formatting.</w:t>
+        <w:t xml:space="preserve"> and -t options for ping and the -n, -q</w:t>
+      </w:r>
+      <w:r>
+        <w:rPr>
+          <w:rFonts w:ascii="Times New Roman" w:hAnsi="Times New Roman" w:cs="Times New Roman"/>
+          <w:color w:val="000000" w:themeColor="text1"/>
+          <w:sz w:val="21"/>
+          <w:szCs w:val="21"/>
+        </w:rPr>
+        <w:t>,</w:t>
+      </w:r>
+      <w:r>
+        <w:rPr>
+          <w:rFonts w:ascii="Times New Roman" w:hAnsi="Times New Roman" w:cs="Times New Roman"/>
+          <w:color w:val="000000" w:themeColor="text1"/>
+          <w:sz w:val="21"/>
+          <w:szCs w:val="21"/>
+        </w:rPr>
+        <w:t xml:space="preserve"> and -S options for traceroute to verify packet matching, timeout handling, and output formatting.</w:t>
       </w:r>
     </w:p>
     <w:p>
@@ -612,13 +590,27 @@
           <w:rFonts w:ascii="Times New Roman" w:hAnsi="Times New Roman" w:cs="Times New Roman"/>
           <w:color w:val="000000" w:themeColor="text1"/>
         </w:rPr>
-        <w:t>below screenshots show the implementation of program</w:t>
+        <w:t>screenshots</w:t>
       </w:r>
       <w:r>
         <w:rPr>
           <w:rFonts w:ascii="Times New Roman" w:hAnsi="Times New Roman" w:cs="Times New Roman"/>
           <w:color w:val="000000" w:themeColor="text1"/>
         </w:rPr>
+        <w:t xml:space="preserve"> below</w:t>
+      </w:r>
+      <w:r>
+        <w:rPr>
+          <w:rFonts w:ascii="Times New Roman" w:hAnsi="Times New Roman" w:cs="Times New Roman"/>
+          <w:color w:val="000000" w:themeColor="text1"/>
+        </w:rPr>
+        <w:t xml:space="preserve"> show the program</w:t>
+      </w:r>
+      <w:r>
+        <w:rPr>
+          <w:rFonts w:ascii="Times New Roman" w:hAnsi="Times New Roman" w:cs="Times New Roman"/>
+          <w:color w:val="000000" w:themeColor="text1"/>
+        </w:rPr>
         <w:t xml:space="preserve"> my_ping.py</w:t>
       </w:r>
       <w:r>
@@ -626,7 +618,21 @@
           <w:rFonts w:ascii="Times New Roman" w:hAnsi="Times New Roman" w:cs="Times New Roman"/>
           <w:color w:val="000000" w:themeColor="text1"/>
         </w:rPr>
-        <w:t xml:space="preserve"> using different flags.</w:t>
+        <w:t xml:space="preserve"> </w:t>
+      </w:r>
+      <w:r>
+        <w:rPr>
+          <w:rFonts w:ascii="Times New Roman" w:hAnsi="Times New Roman" w:cs="Times New Roman"/>
+          <w:color w:val="000000" w:themeColor="text1"/>
+        </w:rPr>
+        <w:t>running with</w:t>
+      </w:r>
+      <w:r>
+        <w:rPr>
+          <w:rFonts w:ascii="Times New Roman" w:hAnsi="Times New Roman" w:cs="Times New Roman"/>
+          <w:color w:val="000000" w:themeColor="text1"/>
+        </w:rPr>
+        <w:t xml:space="preserve"> different flags.</w:t>
       </w:r>
     </w:p>
     <w:p>
@@ -729,6 +735,9 @@
           </w:tcPr>
           <w:p>
             <w:r>
+              <w:rPr>
+                <w:noProof/>
+              </w:rPr>
               <w:drawing>
                 <wp:inline distT="0" distB="0" distL="0" distR="0" wp14:anchorId="4CB95FCA" wp14:editId="2D42F873">
                   <wp:extent cx="5645426" cy="2953595"/>
@@ -860,7 +869,25 @@
           <w:sz w:val="21"/>
           <w:szCs w:val="21"/>
         </w:rPr>
-        <w:t xml:space="preserve"> the last 16 bits of the device PID.</w:t>
+        <w:t xml:space="preserve"> the last 16 bits of the </w:t>
+      </w:r>
+      <w:r>
+        <w:rPr>
+          <w:rFonts w:ascii="Times New Roman" w:hAnsi="Times New Roman" w:cs="Times New Roman"/>
+          <w:color w:val="000000" w:themeColor="text1"/>
+          <w:sz w:val="21"/>
+          <w:szCs w:val="21"/>
+        </w:rPr>
+        <w:t>process ID</w:t>
+      </w:r>
+      <w:r>
+        <w:rPr>
+          <w:rFonts w:ascii="Times New Roman" w:hAnsi="Times New Roman" w:cs="Times New Roman"/>
+          <w:color w:val="000000" w:themeColor="text1"/>
+          <w:sz w:val="21"/>
+          <w:szCs w:val="21"/>
+        </w:rPr>
+        <w:t>.</w:t>
       </w:r>
       <w:r>
         <w:rPr>
@@ -994,6 +1021,9 @@
           </w:tcPr>
           <w:p>
             <w:r>
+              <w:rPr>
+                <w:noProof/>
+              </w:rPr>
               <w:drawing>
                 <wp:inline distT="0" distB="0" distL="0" distR="0" wp14:anchorId="33AF6D5D" wp14:editId="6C03550F">
                   <wp:extent cx="5667594" cy="1542135"/>
@@ -1107,6 +1137,13 @@
           <w:b/>
           <w:bCs/>
         </w:rPr>
+        <w:t xml:space="preserve">The </w:t>
+      </w:r>
+      <w:r>
+        <w:rPr>
+          <w:b/>
+          <w:bCs/>
+        </w:rPr>
         <w:t>t</w:t>
       </w:r>
       <w:r>
@@ -1135,7 +1172,21 @@
           <w:b/>
           <w:bCs/>
         </w:rPr>
-        <w:t>used for timeout and -</w:t>
+        <w:t>used for timeout</w:t>
+      </w:r>
+      <w:r>
+        <w:rPr>
+          <w:b/>
+          <w:bCs/>
+        </w:rPr>
+        <w:t>,</w:t>
+      </w:r>
+      <w:r>
+        <w:rPr>
+          <w:b/>
+          <w:bCs/>
+        </w:rPr>
+        <w:t xml:space="preserve"> and -</w:t>
       </w:r>
       <w:proofErr w:type="spellStart"/>
       <w:r>
@@ -1165,7 +1216,21 @@
           <w:b/>
           <w:bCs/>
         </w:rPr>
-        <w:t xml:space="preserve"> used for waiting </w:t>
+        <w:t xml:space="preserve"> </w:t>
+      </w:r>
+      <w:r>
+        <w:rPr>
+          <w:b/>
+          <w:bCs/>
+        </w:rPr>
+        <w:t xml:space="preserve">is </w:t>
+      </w:r>
+      <w:r>
+        <w:rPr>
+          <w:b/>
+          <w:bCs/>
+        </w:rPr>
+        <w:t xml:space="preserve">used for waiting </w:t>
       </w:r>
       <w:r>
         <w:rPr>
@@ -1299,6 +1364,7 @@
         </w:rPr>
         <w:t xml:space="preserve"> python3 my_ping.py -</w:t>
       </w:r>
+      <w:proofErr w:type="spellStart"/>
       <w:r>
         <w:rPr>
           <w:rFonts w:ascii="Consolas" w:eastAsia="Consolas" w:hAnsi="Consolas" w:cs="Consolas"/>
@@ -1307,6 +1373,7 @@
         </w:rPr>
         <w:t>i</w:t>
       </w:r>
+      <w:proofErr w:type="spellEnd"/>
       <w:r>
         <w:rPr>
           <w:rFonts w:ascii="Consolas" w:eastAsia="Consolas" w:hAnsi="Consolas" w:cs="Consolas"/>
@@ -1430,15 +1497,7 @@
           <w:sz w:val="20"/>
           <w:szCs w:val="20"/>
         </w:rPr>
-        <w:t xml:space="preserve"> 2 </w:t>
-      </w:r>
-      <w:r>
-        <w:rPr>
-          <w:rFonts w:ascii="Consolas" w:eastAsia="Consolas" w:hAnsi="Consolas" w:cs="Consolas"/>
-          <w:sz w:val="20"/>
-          <w:szCs w:val="20"/>
-        </w:rPr>
-        <w:t xml:space="preserve">google.com </w:t>
+        <w:t xml:space="preserve"> 2 google.com </w:t>
       </w:r>
     </w:p>
     <w:tbl>
@@ -1479,6 +1538,9 @@
           </w:tcPr>
           <w:p>
             <w:r>
+              <w:rPr>
+                <w:noProof/>
+              </w:rPr>
               <w:drawing>
                 <wp:inline distT="0" distB="0" distL="0" distR="0" wp14:anchorId="4538D761" wp14:editId="30AB7144">
                   <wp:extent cx="5667594" cy="1532313"/>
@@ -1556,6 +1618,9 @@
           </w:tcPr>
           <w:p>
             <w:r>
+              <w:rPr>
+                <w:noProof/>
+              </w:rPr>
               <w:drawing>
                 <wp:inline distT="0" distB="0" distL="0" distR="0" wp14:anchorId="02B312A6" wp14:editId="2ADF1457">
                   <wp:extent cx="5667375" cy="1656617"/>
@@ -1666,10 +1731,7 @@
             </w:pPr>
             <w:r>
               <w:lastRenderedPageBreak/>
-              <w:t xml:space="preserve">Output from Program for flag </w:t>
-            </w:r>
-            <w:r>
-              <w:t xml:space="preserve">t and </w:t>
+              <w:t xml:space="preserve">Output from Program for flag t and </w:t>
             </w:r>
             <w:proofErr w:type="spellStart"/>
             <w:r>
@@ -1693,6 +1755,9 @@
               <w:jc w:val="both"/>
             </w:pPr>
             <w:r>
+              <w:rPr>
+                <w:noProof/>
+              </w:rPr>
               <w:drawing>
                 <wp:inline distT="0" distB="0" distL="0" distR="0" wp14:anchorId="0B504F47" wp14:editId="22FE0D31">
                   <wp:extent cx="5667594" cy="1430744"/>
@@ -1786,7 +1851,25 @@
         <w:rPr>
           <w:rFonts w:ascii="Times New Roman" w:hAnsi="Times New Roman" w:cs="Times New Roman"/>
         </w:rPr>
-        <w:t xml:space="preserve"> is set to 5 seconds, the packets are transmitted for 5 seconds before the program exits. The default packet timeout of </w:t>
+        <w:t xml:space="preserve"> is set to 5 seconds, the packets are transmitted for 5 seconds before the program exits. The default </w:t>
+      </w:r>
+      <w:r>
+        <w:rPr>
+          <w:rFonts w:ascii="Times New Roman" w:hAnsi="Times New Roman" w:cs="Times New Roman"/>
+        </w:rPr>
+        <w:t>interval between packets</w:t>
+      </w:r>
+      <w:r>
+        <w:rPr>
+          <w:rFonts w:ascii="Times New Roman" w:hAnsi="Times New Roman" w:cs="Times New Roman"/>
+        </w:rPr>
+        <w:t xml:space="preserve"> </w:t>
+      </w:r>
+      <w:r>
+        <w:rPr>
+          <w:rFonts w:ascii="Times New Roman" w:hAnsi="Times New Roman" w:cs="Times New Roman"/>
+        </w:rPr>
+        <w:t xml:space="preserve">of </w:t>
       </w:r>
       <w:proofErr w:type="spellStart"/>
       <w:r>
@@ -1814,13 +1897,37 @@
         <w:rPr>
           <w:rFonts w:ascii="Times New Roman" w:hAnsi="Times New Roman" w:cs="Times New Roman"/>
         </w:rPr>
-        <w:t xml:space="preserve">” flag, the wait time between packets is set to the specified numerical count. </w:t>
-      </w:r>
-      <w:r>
-        <w:rPr>
-          <w:rFonts w:ascii="Times New Roman" w:hAnsi="Times New Roman" w:cs="Times New Roman"/>
-        </w:rPr>
-        <w:t>But, the program keeps streaming continuously until a keyboard interrupt is raised.</w:t>
+        <w:t xml:space="preserve">” flag, the </w:t>
+      </w:r>
+      <w:r>
+        <w:rPr>
+          <w:rFonts w:ascii="Times New Roman" w:hAnsi="Times New Roman" w:cs="Times New Roman"/>
+        </w:rPr>
+        <w:t>interval</w:t>
+      </w:r>
+      <w:r>
+        <w:rPr>
+          <w:rFonts w:ascii="Times New Roman" w:hAnsi="Times New Roman" w:cs="Times New Roman"/>
+        </w:rPr>
+        <w:t xml:space="preserve"> between packets is set to the specified num</w:t>
+      </w:r>
+      <w:r>
+        <w:rPr>
+          <w:rFonts w:ascii="Times New Roman" w:hAnsi="Times New Roman" w:cs="Times New Roman"/>
+        </w:rPr>
+        <w:t>ber of seconds</w:t>
+      </w:r>
+      <w:r>
+        <w:rPr>
+          <w:rFonts w:ascii="Times New Roman" w:hAnsi="Times New Roman" w:cs="Times New Roman"/>
+        </w:rPr>
+        <w:t xml:space="preserve">. </w:t>
+      </w:r>
+      <w:r>
+        <w:rPr>
+          <w:rFonts w:ascii="Times New Roman" w:hAnsi="Times New Roman" w:cs="Times New Roman"/>
+        </w:rPr>
+        <w:t>But the program keeps streaming continuously until a keyboard interrupt is raised.</w:t>
       </w:r>
     </w:p>
     <w:p>
@@ -1842,7 +1949,43 @@
         <w:rPr>
           <w:rFonts w:ascii="Times New Roman" w:hAnsi="Times New Roman" w:cs="Times New Roman"/>
         </w:rPr>
-        <w:t>Combining both the flags has a clear representation that, if time out is set to 10 seconds, and wait time is set to 2 seconds, then the number of packets transmitted and received ideally should be 10/2 = 5, and we can see from the output that clearly there are only 5 packets transmitted by combining both the flags.</w:t>
+        <w:t>Combining both the flags has a clear representation that, if t</w:t>
+      </w:r>
+      <w:r>
+        <w:rPr>
+          <w:rFonts w:ascii="Times New Roman" w:hAnsi="Times New Roman" w:cs="Times New Roman"/>
+        </w:rPr>
+        <w:t>h</w:t>
+      </w:r>
+      <w:r>
+        <w:rPr>
+          <w:rFonts w:ascii="Times New Roman" w:hAnsi="Times New Roman" w:cs="Times New Roman"/>
+        </w:rPr>
+        <w:t xml:space="preserve">e </w:t>
+      </w:r>
+      <w:r>
+        <w:rPr>
+          <w:rFonts w:ascii="Times New Roman" w:hAnsi="Times New Roman" w:cs="Times New Roman"/>
+        </w:rPr>
+        <w:t>time</w:t>
+      </w:r>
+      <w:r>
+        <w:rPr>
+          <w:rFonts w:ascii="Times New Roman" w:hAnsi="Times New Roman" w:cs="Times New Roman"/>
+        </w:rPr>
+        <w:t xml:space="preserve">out is set to 10 seconds, and </w:t>
+      </w:r>
+      <w:r>
+        <w:rPr>
+          <w:rFonts w:ascii="Times New Roman" w:hAnsi="Times New Roman" w:cs="Times New Roman"/>
+        </w:rPr>
+        <w:t>the interval</w:t>
+      </w:r>
+      <w:r>
+        <w:rPr>
+          <w:rFonts w:ascii="Times New Roman" w:hAnsi="Times New Roman" w:cs="Times New Roman"/>
+        </w:rPr>
+        <w:t xml:space="preserve"> time is set to 2 seconds, then the number of packets transmitted and received ideally should be 10/2 = 5, and we can see from the output that clearly there are only 5 packets transmitted by combining both the flags.</w:t>
       </w:r>
     </w:p>
     <w:p>
@@ -1944,6 +2087,9 @@
           </w:tcPr>
           <w:p>
             <w:r>
+              <w:rPr>
+                <w:noProof/>
+              </w:rPr>
               <w:drawing>
                 <wp:inline distT="0" distB="0" distL="0" distR="0" wp14:anchorId="65FFA069" wp14:editId="1AB9D348">
                   <wp:extent cx="5667594" cy="1257469"/>
@@ -2026,7 +2172,19 @@
         <w:rPr>
           <w:rFonts w:ascii="Times New Roman" w:eastAsia="Consolas" w:hAnsi="Times New Roman" w:cs="Times New Roman"/>
         </w:rPr>
-        <w:t xml:space="preserve"> the 3 packets are carrying data payload of 128 bytes, while the </w:t>
+        <w:t xml:space="preserve"> the 3 packets are carrying </w:t>
+      </w:r>
+      <w:r>
+        <w:rPr>
+          <w:rFonts w:ascii="Times New Roman" w:eastAsia="Consolas" w:hAnsi="Times New Roman" w:cs="Times New Roman"/>
+        </w:rPr>
+        <w:t xml:space="preserve">a </w:t>
+      </w:r>
+      <w:r>
+        <w:rPr>
+          <w:rFonts w:ascii="Times New Roman" w:eastAsia="Consolas" w:hAnsi="Times New Roman" w:cs="Times New Roman"/>
+        </w:rPr>
+        <w:t xml:space="preserve">data payload of 128 bytes, while </w:t>
       </w:r>
       <w:proofErr w:type="spellStart"/>
       <w:r>
@@ -2040,7 +2198,31 @@
         <w:rPr>
           <w:rFonts w:ascii="Times New Roman" w:eastAsia="Consolas" w:hAnsi="Times New Roman" w:cs="Times New Roman"/>
         </w:rPr>
-        <w:t xml:space="preserve"> shows 136 bytes because the 8 bytes of ICMP header information is added when the packet is constructed. Thus </w:t>
+        <w:t xml:space="preserve"> shows 136 bytes because the 8 bytes of ICMP header information </w:t>
+      </w:r>
+      <w:r>
+        <w:rPr>
+          <w:rFonts w:ascii="Times New Roman" w:eastAsia="Consolas" w:hAnsi="Times New Roman" w:cs="Times New Roman"/>
+        </w:rPr>
+        <w:t>are</w:t>
+      </w:r>
+      <w:r>
+        <w:rPr>
+          <w:rFonts w:ascii="Times New Roman" w:eastAsia="Consolas" w:hAnsi="Times New Roman" w:cs="Times New Roman"/>
+        </w:rPr>
+        <w:t xml:space="preserve"> added when the packet is constructed. Thus</w:t>
+      </w:r>
+      <w:r>
+        <w:rPr>
+          <w:rFonts w:ascii="Times New Roman" w:eastAsia="Consolas" w:hAnsi="Times New Roman" w:cs="Times New Roman"/>
+        </w:rPr>
+        <w:t>,</w:t>
+      </w:r>
+      <w:r>
+        <w:rPr>
+          <w:rFonts w:ascii="Times New Roman" w:eastAsia="Consolas" w:hAnsi="Times New Roman" w:cs="Times New Roman"/>
+        </w:rPr>
+        <w:t xml:space="preserve"> </w:t>
       </w:r>
       <w:proofErr w:type="spellStart"/>
       <w:r>
@@ -2070,7 +2252,7 @@
           <w:b/>
           <w:bCs/>
         </w:rPr>
-        <w:t>2.5 What if the host name is not found or unreachable?</w:t>
+        <w:t>2.5 What if the hostname is not found or unreachable?</w:t>
       </w:r>
     </w:p>
     <w:p>
@@ -2114,7 +2296,23 @@
           <w:sz w:val="20"/>
           <w:szCs w:val="20"/>
         </w:rPr>
-        <w:t xml:space="preserve"> python3 my_ping.py -c 3 </w:t>
+        <w:t xml:space="preserve"> python3 my_ping.py -c </w:t>
+      </w:r>
+      <w:r>
+        <w:rPr>
+          <w:rFonts w:ascii="Consolas" w:eastAsia="Consolas" w:hAnsi="Consolas" w:cs="Consolas"/>
+          <w:sz w:val="20"/>
+          <w:szCs w:val="20"/>
+        </w:rPr>
+        <w:t>5</w:t>
+      </w:r>
+      <w:r>
+        <w:rPr>
+          <w:rFonts w:ascii="Consolas" w:eastAsia="Consolas" w:hAnsi="Consolas" w:cs="Consolas"/>
+          <w:sz w:val="20"/>
+          <w:szCs w:val="20"/>
+        </w:rPr>
+        <w:t xml:space="preserve"> </w:t>
       </w:r>
       <w:r>
         <w:rPr>
@@ -2157,33 +2355,47 @@
           <w:sz w:val="20"/>
           <w:szCs w:val="20"/>
         </w:rPr>
-        <w:t xml:space="preserve"> python3 my_ping.py -c 3 </w:t>
-      </w:r>
-      <w:r>
-        <w:rPr>
-          <w:rFonts w:ascii="Consolas" w:eastAsia="Consolas" w:hAnsi="Consolas" w:cs="Consolas"/>
-          <w:sz w:val="20"/>
-          <w:szCs w:val="20"/>
-        </w:rPr>
-        <w:t xml:space="preserve">googlerit.com (host that </w:t>
-      </w:r>
-      <w:proofErr w:type="spellStart"/>
-      <w:r>
-        <w:rPr>
-          <w:rFonts w:ascii="Consolas" w:eastAsia="Consolas" w:hAnsi="Consolas" w:cs="Consolas"/>
-          <w:sz w:val="20"/>
-          <w:szCs w:val="20"/>
-        </w:rPr>
-        <w:t>doesnot</w:t>
-      </w:r>
-      <w:proofErr w:type="spellEnd"/>
-      <w:r>
-        <w:rPr>
-          <w:rFonts w:ascii="Consolas" w:eastAsia="Consolas" w:hAnsi="Consolas" w:cs="Consolas"/>
-          <w:sz w:val="20"/>
-          <w:szCs w:val="20"/>
-        </w:rPr>
-        <w:t xml:space="preserve"> exist)</w:t>
+        <w:t xml:space="preserve"> python3 my_ping.py -c </w:t>
+      </w:r>
+      <w:r>
+        <w:rPr>
+          <w:rFonts w:ascii="Consolas" w:eastAsia="Consolas" w:hAnsi="Consolas" w:cs="Consolas"/>
+          <w:sz w:val="20"/>
+          <w:szCs w:val="20"/>
+        </w:rPr>
+        <w:t>5</w:t>
+      </w:r>
+      <w:r>
+        <w:rPr>
+          <w:rFonts w:ascii="Consolas" w:eastAsia="Consolas" w:hAnsi="Consolas" w:cs="Consolas"/>
+          <w:sz w:val="20"/>
+          <w:szCs w:val="20"/>
+        </w:rPr>
+        <w:t xml:space="preserve"> </w:t>
+      </w:r>
+      <w:r>
+        <w:rPr>
+          <w:rFonts w:ascii="Consolas" w:eastAsia="Consolas" w:hAnsi="Consolas" w:cs="Consolas"/>
+          <w:sz w:val="20"/>
+          <w:szCs w:val="20"/>
+        </w:rPr>
+        <w:t>googlerit.com (host that does</w:t>
+      </w:r>
+      <w:r>
+        <w:rPr>
+          <w:rFonts w:ascii="Consolas" w:eastAsia="Consolas" w:hAnsi="Consolas" w:cs="Consolas"/>
+          <w:sz w:val="20"/>
+          <w:szCs w:val="20"/>
+        </w:rPr>
+        <w:t xml:space="preserve"> </w:t>
+      </w:r>
+      <w:r>
+        <w:rPr>
+          <w:rFonts w:ascii="Consolas" w:eastAsia="Consolas" w:hAnsi="Consolas" w:cs="Consolas"/>
+          <w:sz w:val="20"/>
+          <w:szCs w:val="20"/>
+        </w:rPr>
+        <w:t>not exist)</w:t>
       </w:r>
     </w:p>
     <w:p>
@@ -2250,11 +2462,7 @@
           </w:tcPr>
           <w:p>
             <w:r>
-              <w:lastRenderedPageBreak/>
-              <w:t xml:space="preserve">Output from Program for </w:t>
-            </w:r>
-            <w:r>
-              <w:t>unreachable host</w:t>
+              <w:t>Output from Program for unreachable host</w:t>
             </w:r>
           </w:p>
         </w:tc>
@@ -2270,6 +2478,9 @@
           </w:tcPr>
           <w:p>
             <w:r>
+              <w:rPr>
+                <w:noProof/>
+              </w:rPr>
               <w:drawing>
                 <wp:inline distT="0" distB="0" distL="0" distR="0" wp14:anchorId="4D63118E" wp14:editId="6CA54847">
                   <wp:extent cx="4455711" cy="1532313"/>
@@ -2326,10 +2537,7 @@
           </w:tcPr>
           <w:p>
             <w:r>
-              <w:t xml:space="preserve">Output from Program for </w:t>
-            </w:r>
-            <w:r>
-              <w:t>unknown host</w:t>
+              <w:t>Output from Program for unknown host</w:t>
             </w:r>
           </w:p>
         </w:tc>
@@ -2345,6 +2553,9 @@
           </w:tcPr>
           <w:p>
             <w:r>
+              <w:rPr>
+                <w:noProof/>
+              </w:rPr>
               <w:drawing>
                 <wp:inline distT="0" distB="0" distL="0" distR="0" wp14:anchorId="1BD2C7E0" wp14:editId="004AAE6D">
                   <wp:extent cx="5700409" cy="298119"/>
@@ -2434,19 +2645,49 @@
         <w:rPr>
           <w:rFonts w:ascii="Times New Roman" w:hAnsi="Times New Roman" w:cs="Times New Roman"/>
         </w:rPr>
-        <w:t xml:space="preserve"> gives an error that says “Socket is not connected” whereas if the host is unknown or does</w:t>
-      </w:r>
-      <w:r>
-        <w:rPr>
-          <w:rFonts w:ascii="Times New Roman" w:hAnsi="Times New Roman" w:cs="Times New Roman"/>
-        </w:rPr>
         <w:t xml:space="preserve"> </w:t>
       </w:r>
       <w:r>
         <w:rPr>
           <w:rFonts w:ascii="Times New Roman" w:hAnsi="Times New Roman" w:cs="Times New Roman"/>
         </w:rPr>
-        <w:t>not exist, then it prints “Unknown host”.</w:t>
+        <w:t>return</w:t>
+      </w:r>
+      <w:r>
+        <w:rPr>
+          <w:rFonts w:ascii="Times New Roman" w:hAnsi="Times New Roman" w:cs="Times New Roman"/>
+        </w:rPr>
+        <w:t>s an error that says “Socket is not connected</w:t>
+      </w:r>
+      <w:r>
+        <w:rPr>
+          <w:rFonts w:ascii="Times New Roman" w:hAnsi="Times New Roman" w:cs="Times New Roman"/>
+        </w:rPr>
+        <w:t>,</w:t>
+      </w:r>
+      <w:r>
+        <w:rPr>
+          <w:rFonts w:ascii="Times New Roman" w:hAnsi="Times New Roman" w:cs="Times New Roman"/>
+        </w:rPr>
+        <w:t>” whereas if the host is unknown or does</w:t>
+      </w:r>
+      <w:r>
+        <w:rPr>
+          <w:rFonts w:ascii="Times New Roman" w:hAnsi="Times New Roman" w:cs="Times New Roman"/>
+        </w:rPr>
+        <w:t xml:space="preserve"> </w:t>
+      </w:r>
+      <w:r>
+        <w:rPr>
+          <w:rFonts w:ascii="Times New Roman" w:hAnsi="Times New Roman" w:cs="Times New Roman"/>
+        </w:rPr>
+        <w:t>not exist, it prints “Unknown host</w:t>
+      </w:r>
+      <w:r>
+        <w:rPr>
+          <w:rFonts w:ascii="Times New Roman" w:hAnsi="Times New Roman" w:cs="Times New Roman"/>
+        </w:rPr>
+        <w:t>.”</w:t>
       </w:r>
     </w:p>
     <w:p>
@@ -2486,27 +2727,7 @@
           <w:sz w:val="31"/>
           <w:szCs w:val="31"/>
         </w:rPr>
-        <w:t xml:space="preserve"> of the Program for different flags used with my_</w:t>
-      </w:r>
-      <w:r>
-        <w:rPr>
-          <w:b/>
-          <w:bCs/>
-          <w:color w:val="2E5395"/>
-          <w:sz w:val="31"/>
-          <w:szCs w:val="31"/>
-        </w:rPr>
-        <w:t>traceroute</w:t>
-      </w:r>
-      <w:r>
-        <w:rPr>
-          <w:b/>
-          <w:bCs/>
-          <w:color w:val="2E5395"/>
-          <w:sz w:val="31"/>
-          <w:szCs w:val="31"/>
-        </w:rPr>
-        <w:t>.py</w:t>
+        <w:t xml:space="preserve"> of the Program for different flags used with my_traceroute.py</w:t>
       </w:r>
     </w:p>
     <w:p>
@@ -2528,21 +2749,14 @@
           <w:rFonts w:ascii="Times New Roman" w:hAnsi="Times New Roman" w:cs="Times New Roman"/>
           <w:color w:val="000000" w:themeColor="text1"/>
         </w:rPr>
-        <w:t>below screenshots show the implementation of program my_</w:t>
+        <w:t>screenshots below show the implementation of the program my_traceroute.py with</w:t>
       </w:r>
       <w:r>
         <w:rPr>
           <w:rFonts w:ascii="Times New Roman" w:hAnsi="Times New Roman" w:cs="Times New Roman"/>
           <w:color w:val="000000" w:themeColor="text1"/>
         </w:rPr>
-        <w:t>traceroute</w:t>
-      </w:r>
-      <w:r>
-        <w:rPr>
-          <w:rFonts w:ascii="Times New Roman" w:hAnsi="Times New Roman" w:cs="Times New Roman"/>
-          <w:color w:val="000000" w:themeColor="text1"/>
-        </w:rPr>
-        <w:t>.py using different flags.</w:t>
+        <w:t xml:space="preserve"> different flags.</w:t>
       </w:r>
     </w:p>
     <w:p>
@@ -2640,6 +2854,9 @@
           </w:tcPr>
           <w:p>
             <w:r>
+              <w:rPr>
+                <w:noProof/>
+              </w:rPr>
               <w:drawing>
                 <wp:inline distT="0" distB="0" distL="0" distR="0" wp14:anchorId="3176A32C" wp14:editId="2F5EA8AD">
                   <wp:extent cx="5667594" cy="1448667"/>
@@ -2711,14 +2928,12 @@
         </w:rPr>
         <w:t xml:space="preserve">We can see that the my_traceroute.py maps out the number of hops that a packet takes before it reaches the destination </w:t>
       </w:r>
-      <w:proofErr w:type="spellStart"/>
-      <w:r>
-        <w:rPr>
-          <w:rFonts w:ascii="Times New Roman" w:hAnsi="Times New Roman" w:cs="Times New Roman"/>
-        </w:rPr>
-        <w:t>ip</w:t>
-      </w:r>
-      <w:proofErr w:type="spellEnd"/>
+      <w:r>
+        <w:rPr>
+          <w:rFonts w:ascii="Times New Roman" w:hAnsi="Times New Roman" w:cs="Times New Roman"/>
+        </w:rPr>
+        <w:t>IP</w:t>
+      </w:r>
       <w:r>
         <w:rPr>
           <w:rFonts w:ascii="Times New Roman" w:hAnsi="Times New Roman" w:cs="Times New Roman"/>
@@ -2792,17 +3007,10 @@
     </w:p>
     <w:p>
       <w:pPr>
-        <w:jc w:val="both"/>
-        <w:rPr>
-          <w:rFonts w:ascii="Times New Roman" w:hAnsi="Times New Roman" w:cs="Times New Roman"/>
-        </w:rPr>
-      </w:pPr>
-    </w:p>
-    <w:p>
-      <w:pPr>
-        <w:jc w:val="both"/>
-        <w:rPr>
-          <w:rFonts w:ascii="Times New Roman" w:hAnsi="Times New Roman" w:cs="Times New Roman"/>
+        <w:pStyle w:val="Heading2"/>
+        <w:rPr>
+          <w:b/>
+          <w:bCs/>
         </w:rPr>
       </w:pPr>
     </w:p>
@@ -2864,15 +3072,7 @@
           <w:sz w:val="20"/>
           <w:szCs w:val="20"/>
         </w:rPr>
-        <w:t>my_</w:t>
-      </w:r>
-      <w:r>
-        <w:rPr>
-          <w:rFonts w:ascii="Consolas" w:eastAsia="Consolas" w:hAnsi="Consolas" w:cs="Consolas"/>
-          <w:sz w:val="20"/>
-          <w:szCs w:val="20"/>
-        </w:rPr>
-        <w:t>traceroute</w:t>
+        <w:t>my_traceroute</w:t>
       </w:r>
       <w:r>
         <w:rPr>
@@ -2934,6 +3134,9 @@
           </w:tcPr>
           <w:p>
             <w:r>
+              <w:rPr>
+                <w:noProof/>
+              </w:rPr>
               <w:drawing>
                 <wp:inline distT="0" distB="0" distL="0" distR="0" wp14:anchorId="18D8D932" wp14:editId="52110D4F">
                   <wp:extent cx="5667594" cy="1338534"/>
@@ -3022,7 +3225,7 @@
         <w:rPr>
           <w:rFonts w:ascii="Times New Roman" w:eastAsia="Consolas" w:hAnsi="Times New Roman" w:cs="Times New Roman"/>
         </w:rPr>
-        <w:t xml:space="preserve"> hop addresses numerically rather than symbolically and numerically.</w:t>
+        <w:t xml:space="preserve"> hop addresses numerically rather than symbolically.</w:t>
       </w:r>
     </w:p>
     <w:p>
@@ -3112,6 +3315,9 @@
           </w:tcPr>
           <w:p>
             <w:r>
+              <w:rPr>
+                <w:noProof/>
+              </w:rPr>
               <w:drawing>
                 <wp:inline distT="0" distB="0" distL="0" distR="0" wp14:anchorId="21770302" wp14:editId="6DBB2F40">
                   <wp:extent cx="5667590" cy="1338534"/>
@@ -3182,25 +3388,7 @@
         <w:rPr>
           <w:rFonts w:ascii="Times New Roman" w:eastAsia="Consolas" w:hAnsi="Times New Roman" w:cs="Times New Roman"/>
         </w:rPr>
-        <w:t>We can see from the picture that the -</w:t>
-      </w:r>
-      <w:r>
-        <w:rPr>
-          <w:rFonts w:ascii="Times New Roman" w:eastAsia="Consolas" w:hAnsi="Times New Roman" w:cs="Times New Roman"/>
-        </w:rPr>
-        <w:t>q</w:t>
-      </w:r>
-      <w:r>
-        <w:rPr>
-          <w:rFonts w:ascii="Times New Roman" w:eastAsia="Consolas" w:hAnsi="Times New Roman" w:cs="Times New Roman"/>
-        </w:rPr>
-        <w:t xml:space="preserve"> flag successfully </w:t>
-      </w:r>
-      <w:r>
-        <w:rPr>
-          <w:rFonts w:ascii="Times New Roman" w:eastAsia="Consolas" w:hAnsi="Times New Roman" w:cs="Times New Roman"/>
-        </w:rPr>
-        <w:t>s</w:t>
+        <w:t>We can see from the picture that the -q flag successfully s</w:t>
       </w:r>
       <w:r>
         <w:rPr>
@@ -3447,6 +3635,9 @@
           </w:tcPr>
           <w:p>
             <w:r>
+              <w:rPr>
+                <w:noProof/>
+              </w:rPr>
               <w:drawing>
                 <wp:inline distT="0" distB="0" distL="0" distR="0" wp14:anchorId="21F1AEB6" wp14:editId="4FC851E9">
                   <wp:extent cx="4591878" cy="2237598"/>
@@ -3517,42 +3708,24 @@
         <w:rPr>
           <w:rFonts w:ascii="Times New Roman" w:eastAsia="Consolas" w:hAnsi="Times New Roman" w:cs="Times New Roman"/>
         </w:rPr>
-        <w:t>We can see from the picture that the -</w:t>
+        <w:t>We can see from the picture that the -S (uppercase only) flag successfully p</w:t>
       </w:r>
       <w:r>
         <w:rPr>
           <w:rFonts w:ascii="Times New Roman" w:eastAsia="Consolas" w:hAnsi="Times New Roman" w:cs="Times New Roman"/>
         </w:rPr>
-        <w:t>S (uppercase only)</w:t>
+        <w:t>rint</w:t>
       </w:r>
       <w:r>
         <w:rPr>
           <w:rFonts w:ascii="Times New Roman" w:eastAsia="Consolas" w:hAnsi="Times New Roman" w:cs="Times New Roman"/>
         </w:rPr>
-        <w:t xml:space="preserve"> flag successfully </w:t>
+        <w:t>s</w:t>
       </w:r>
       <w:r>
         <w:rPr>
           <w:rFonts w:ascii="Times New Roman" w:eastAsia="Consolas" w:hAnsi="Times New Roman" w:cs="Times New Roman"/>
         </w:rPr>
-        <w:t>p</w:t>
-      </w:r>
-      <w:r>
-        <w:rPr>
-          <w:rFonts w:ascii="Times New Roman" w:eastAsia="Consolas" w:hAnsi="Times New Roman" w:cs="Times New Roman"/>
-        </w:rPr>
-        <w:t>rint</w:t>
-      </w:r>
-      <w:r>
-        <w:rPr>
-          <w:rFonts w:ascii="Times New Roman" w:eastAsia="Consolas" w:hAnsi="Times New Roman" w:cs="Times New Roman"/>
-        </w:rPr>
-        <w:t>s</w:t>
-      </w:r>
-      <w:r>
-        <w:rPr>
-          <w:rFonts w:ascii="Times New Roman" w:eastAsia="Consolas" w:hAnsi="Times New Roman" w:cs="Times New Roman"/>
-        </w:rPr>
         <w:t xml:space="preserve"> a summary of how many probes were not answered for each hop.</w:t>
       </w:r>
     </w:p>
@@ -3569,14 +3742,7 @@
           <w:b/>
           <w:bCs/>
         </w:rPr>
-        <w:t xml:space="preserve">3.5 </w:t>
-      </w:r>
-      <w:r>
-        <w:rPr>
-          <w:b/>
-          <w:bCs/>
-        </w:rPr>
-        <w:t>What if the host name is not found or unreachable?</w:t>
+        <w:t>3.5 What if the hostname is not found or unreachable?</w:t>
       </w:r>
     </w:p>
     <w:p>
@@ -3703,25 +3869,23 @@
           <w:sz w:val="20"/>
           <w:szCs w:val="20"/>
         </w:rPr>
-        <w:t xml:space="preserve">googlerit.com (host that </w:t>
-      </w:r>
-      <w:proofErr w:type="spellStart"/>
-      <w:r>
-        <w:rPr>
-          <w:rFonts w:ascii="Consolas" w:eastAsia="Consolas" w:hAnsi="Consolas" w:cs="Consolas"/>
-          <w:sz w:val="20"/>
-          <w:szCs w:val="20"/>
-        </w:rPr>
-        <w:t>doesnot</w:t>
-      </w:r>
-      <w:proofErr w:type="spellEnd"/>
-      <w:r>
-        <w:rPr>
-          <w:rFonts w:ascii="Consolas" w:eastAsia="Consolas" w:hAnsi="Consolas" w:cs="Consolas"/>
-          <w:sz w:val="20"/>
-          <w:szCs w:val="20"/>
-        </w:rPr>
-        <w:t xml:space="preserve"> exist)</w:t>
+        <w:t>googlerit.com (host that does</w:t>
+      </w:r>
+      <w:r>
+        <w:rPr>
+          <w:rFonts w:ascii="Consolas" w:eastAsia="Consolas" w:hAnsi="Consolas" w:cs="Consolas"/>
+          <w:sz w:val="20"/>
+          <w:szCs w:val="20"/>
+        </w:rPr>
+        <w:t xml:space="preserve"> </w:t>
+      </w:r>
+      <w:r>
+        <w:rPr>
+          <w:rFonts w:ascii="Consolas" w:eastAsia="Consolas" w:hAnsi="Consolas" w:cs="Consolas"/>
+          <w:sz w:val="20"/>
+          <w:szCs w:val="20"/>
+        </w:rPr>
+        <w:t>not exist)</w:t>
       </w:r>
     </w:p>
     <w:tbl>
@@ -3759,6 +3923,9 @@
           </w:tcPr>
           <w:p>
             <w:r>
+              <w:rPr>
+                <w:noProof/>
+              </w:rPr>
               <w:drawing>
                 <wp:inline distT="0" distB="0" distL="0" distR="0" wp14:anchorId="221476F0" wp14:editId="06239DF2">
                   <wp:extent cx="5493026" cy="3152948"/>
@@ -3834,6 +4001,9 @@
           </w:tcPr>
           <w:p>
             <w:r>
+              <w:rPr>
+                <w:noProof/>
+              </w:rPr>
               <w:lastRenderedPageBreak/>
               <w:drawing>
                 <wp:inline distT="0" distB="0" distL="0" distR="0" wp14:anchorId="1F6F0EB4" wp14:editId="0293D54E">
@@ -3917,56 +4087,114 @@
         <w:rPr>
           <w:rFonts w:ascii="Times New Roman" w:hAnsi="Times New Roman" w:cs="Times New Roman"/>
         </w:rPr>
+        <w:t>my_traceroute</w:t>
+      </w:r>
+      <w:proofErr w:type="spellEnd"/>
+      <w:r>
+        <w:rPr>
+          <w:rFonts w:ascii="Times New Roman" w:hAnsi="Times New Roman" w:cs="Times New Roman"/>
+        </w:rPr>
+        <w:t xml:space="preserve"> </w:t>
+      </w:r>
+      <w:r>
+        <w:rPr>
+          <w:rFonts w:ascii="Times New Roman" w:hAnsi="Times New Roman" w:cs="Times New Roman"/>
+        </w:rPr>
+        <w:t>return</w:t>
+      </w:r>
+      <w:r>
+        <w:rPr>
+          <w:rFonts w:ascii="Times New Roman" w:hAnsi="Times New Roman" w:cs="Times New Roman"/>
+        </w:rPr>
+        <w:t>s an error</w:t>
+      </w:r>
+      <w:r>
+        <w:rPr>
+          <w:rFonts w:ascii="Times New Roman" w:hAnsi="Times New Roman" w:cs="Times New Roman"/>
+        </w:rPr>
+        <w:t>:</w:t>
+      </w:r>
+      <w:r>
+        <w:rPr>
+          <w:rFonts w:ascii="Times New Roman" w:hAnsi="Times New Roman" w:cs="Times New Roman"/>
+        </w:rPr>
+        <w:t xml:space="preserve"> “</w:t>
+      </w:r>
+      <w:r>
+        <w:rPr>
+          <w:rFonts w:ascii="Times New Roman" w:hAnsi="Times New Roman" w:cs="Times New Roman"/>
+        </w:rPr>
+        <w:t>No route to host</w:t>
+      </w:r>
+      <w:r>
+        <w:rPr>
+          <w:rFonts w:ascii="Times New Roman" w:hAnsi="Times New Roman" w:cs="Times New Roman"/>
+        </w:rPr>
+        <w:t>,</w:t>
+      </w:r>
+      <w:r>
+        <w:rPr>
+          <w:rFonts w:ascii="Times New Roman" w:hAnsi="Times New Roman" w:cs="Times New Roman"/>
+        </w:rPr>
+        <w:t>” whereas if the host is unknown or does</w:t>
+      </w:r>
+      <w:r>
+        <w:rPr>
+          <w:rFonts w:ascii="Times New Roman" w:hAnsi="Times New Roman" w:cs="Times New Roman"/>
+        </w:rPr>
+        <w:t xml:space="preserve"> </w:t>
+      </w:r>
+      <w:r>
+        <w:rPr>
+          <w:rFonts w:ascii="Times New Roman" w:hAnsi="Times New Roman" w:cs="Times New Roman"/>
+        </w:rPr>
+        <w:t>not exist, it prints “</w:t>
+      </w:r>
+      <w:r>
+        <w:rPr>
+          <w:rFonts w:ascii="Times New Roman" w:hAnsi="Times New Roman" w:cs="Times New Roman"/>
+        </w:rPr>
+        <w:t>Name or Service not Known</w:t>
+      </w:r>
+      <w:r>
+        <w:rPr>
+          <w:rFonts w:ascii="Times New Roman" w:hAnsi="Times New Roman" w:cs="Times New Roman"/>
+        </w:rPr>
+        <w:t>.”</w:t>
+      </w:r>
+    </w:p>
+    <w:p>
+      <w:pPr>
+        <w:jc w:val="both"/>
+        <w:rPr>
+          <w:rFonts w:ascii="Times New Roman" w:hAnsi="Times New Roman" w:cs="Times New Roman"/>
+        </w:rPr>
+      </w:pPr>
+    </w:p>
+    <w:p>
+      <w:pPr>
+        <w:jc w:val="both"/>
+        <w:rPr>
+          <w:rFonts w:ascii="Times New Roman" w:hAnsi="Times New Roman" w:cs="Times New Roman"/>
+        </w:rPr>
+      </w:pPr>
+      <w:r>
+        <w:rPr>
+          <w:rFonts w:ascii="Times New Roman" w:hAnsi="Times New Roman" w:cs="Times New Roman"/>
+        </w:rPr>
+        <w:t xml:space="preserve">When using </w:t>
+      </w:r>
+      <w:r>
+        <w:rPr>
+          <w:rFonts w:ascii="Times New Roman" w:hAnsi="Times New Roman" w:cs="Times New Roman"/>
+        </w:rPr>
         <w:t>my_</w:t>
       </w:r>
       <w:r>
         <w:rPr>
           <w:rFonts w:ascii="Times New Roman" w:hAnsi="Times New Roman" w:cs="Times New Roman"/>
         </w:rPr>
-        <w:t>traceroute</w:t>
-      </w:r>
-      <w:proofErr w:type="spellEnd"/>
-      <w:r>
-        <w:rPr>
-          <w:rFonts w:ascii="Times New Roman" w:hAnsi="Times New Roman" w:cs="Times New Roman"/>
-        </w:rPr>
-        <w:t xml:space="preserve"> gives an error that says “</w:t>
-      </w:r>
-      <w:r>
-        <w:rPr>
-          <w:rFonts w:ascii="Times New Roman" w:hAnsi="Times New Roman" w:cs="Times New Roman"/>
-        </w:rPr>
-        <w:t>No route to host</w:t>
-      </w:r>
-      <w:r>
-        <w:rPr>
-          <w:rFonts w:ascii="Times New Roman" w:hAnsi="Times New Roman" w:cs="Times New Roman"/>
-        </w:rPr>
-        <w:t>” whereas if the host is unknown or does</w:t>
-      </w:r>
-      <w:r>
-        <w:rPr>
-          <w:rFonts w:ascii="Times New Roman" w:hAnsi="Times New Roman" w:cs="Times New Roman"/>
-        </w:rPr>
-        <w:t xml:space="preserve"> </w:t>
-      </w:r>
-      <w:r>
-        <w:rPr>
-          <w:rFonts w:ascii="Times New Roman" w:hAnsi="Times New Roman" w:cs="Times New Roman"/>
-        </w:rPr>
-        <w:t>not exist, then it prints “</w:t>
-      </w:r>
-      <w:r>
-        <w:rPr>
-          <w:rFonts w:ascii="Times New Roman" w:hAnsi="Times New Roman" w:cs="Times New Roman"/>
-        </w:rPr>
-        <w:t>Name or Service not Known</w:t>
-      </w:r>
-      <w:r>
-        <w:rPr>
-          <w:rFonts w:ascii="Times New Roman" w:hAnsi="Times New Roman" w:cs="Times New Roman"/>
-        </w:rPr>
-        <w:t>”.</w:t>
+        <w:t>traceroute on an unreachable host, the program must be terminated with Ctrl-C so it does not keep waiting until 64 hops (the default maximum) have been tested.</w:t>
       </w:r>
     </w:p>
     <w:p/>
@@ -4135,6 +4363,12 @@
         <w:rPr>
           <w:rFonts w:ascii="Times New Roman" w:hAnsi="Times New Roman" w:cs="Times New Roman"/>
         </w:rPr>
+        <w:t>,</w:t>
+      </w:r>
+      <w:r>
+        <w:rPr>
+          <w:rFonts w:ascii="Times New Roman" w:hAnsi="Times New Roman" w:cs="Times New Roman"/>
+        </w:rPr>
         <w:t xml:space="preserve"> whereas </w:t>
       </w:r>
       <w:proofErr w:type="spellStart"/>
@@ -4149,7 +4383,31 @@
         <w:rPr>
           <w:rFonts w:ascii="Times New Roman" w:hAnsi="Times New Roman" w:cs="Times New Roman"/>
         </w:rPr>
-        <w:t xml:space="preserve"> has a hard coded timeout that is set to 1 second. </w:t>
+        <w:t xml:space="preserve"> has a hard</w:t>
+      </w:r>
+      <w:r>
+        <w:rPr>
+          <w:rFonts w:ascii="Times New Roman" w:hAnsi="Times New Roman" w:cs="Times New Roman"/>
+        </w:rPr>
+        <w:t>-</w:t>
+      </w:r>
+      <w:r>
+        <w:rPr>
+          <w:rFonts w:ascii="Times New Roman" w:hAnsi="Times New Roman" w:cs="Times New Roman"/>
+        </w:rPr>
+        <w:t xml:space="preserve">coded </w:t>
+      </w:r>
+      <w:r>
+        <w:rPr>
+          <w:rFonts w:ascii="Times New Roman" w:hAnsi="Times New Roman" w:cs="Times New Roman"/>
+        </w:rPr>
+        <w:t>minimum wait of 1 second per reply</w:t>
+      </w:r>
+      <w:r>
+        <w:rPr>
+          <w:rFonts w:ascii="Times New Roman" w:hAnsi="Times New Roman" w:cs="Times New Roman"/>
+        </w:rPr>
+        <w:t xml:space="preserve">. </w:t>
       </w:r>
     </w:p>
     <w:p>
@@ -4168,13 +4426,49 @@
         <w:rPr>
           <w:rFonts w:ascii="Times New Roman" w:hAnsi="Times New Roman" w:cs="Times New Roman"/>
         </w:rPr>
-        <w:t xml:space="preserve">Native ping supports a -m flag to set the Time to Live (TTL) of the packets before they reach the destined </w:t>
-      </w:r>
-      <w:r>
-        <w:rPr>
-          <w:rFonts w:ascii="Times New Roman" w:hAnsi="Times New Roman" w:cs="Times New Roman"/>
-        </w:rPr>
-        <w:t xml:space="preserve">address, </w:t>
+        <w:t xml:space="preserve">Native ping supports </w:t>
+      </w:r>
+      <w:r>
+        <w:rPr>
+          <w:rFonts w:ascii="Times New Roman" w:hAnsi="Times New Roman" w:cs="Times New Roman"/>
+        </w:rPr>
+        <w:t>the</w:t>
+      </w:r>
+      <w:r>
+        <w:rPr>
+          <w:rFonts w:ascii="Times New Roman" w:hAnsi="Times New Roman" w:cs="Times New Roman"/>
+        </w:rPr>
+        <w:t xml:space="preserve"> -m flag to set the Time to Live (TTL) of packets before they reach the destin</w:t>
+      </w:r>
+      <w:r>
+        <w:rPr>
+          <w:rFonts w:ascii="Times New Roman" w:hAnsi="Times New Roman" w:cs="Times New Roman"/>
+        </w:rPr>
+        <w:t>ation</w:t>
+      </w:r>
+      <w:r>
+        <w:rPr>
+          <w:rFonts w:ascii="Times New Roman" w:hAnsi="Times New Roman" w:cs="Times New Roman"/>
+        </w:rPr>
+        <w:t xml:space="preserve"> </w:t>
+      </w:r>
+      <w:r>
+        <w:rPr>
+          <w:rFonts w:ascii="Times New Roman" w:hAnsi="Times New Roman" w:cs="Times New Roman"/>
+        </w:rPr>
+        <w:t>address</w:t>
+      </w:r>
+      <w:r>
+        <w:rPr>
+          <w:rFonts w:ascii="Times New Roman" w:hAnsi="Times New Roman" w:cs="Times New Roman"/>
+        </w:rPr>
+        <w:t>;</w:t>
+      </w:r>
+      <w:r>
+        <w:rPr>
+          <w:rFonts w:ascii="Times New Roman" w:hAnsi="Times New Roman" w:cs="Times New Roman"/>
+        </w:rPr>
+        <w:t xml:space="preserve"> </w:t>
       </w:r>
       <w:proofErr w:type="spellStart"/>
       <w:r>
@@ -4188,7 +4482,19 @@
         <w:rPr>
           <w:rFonts w:ascii="Times New Roman" w:hAnsi="Times New Roman" w:cs="Times New Roman"/>
         </w:rPr>
-        <w:t xml:space="preserve"> does not have this functionality.</w:t>
+        <w:t xml:space="preserve"> does not </w:t>
+      </w:r>
+      <w:r>
+        <w:rPr>
+          <w:rFonts w:ascii="Times New Roman" w:hAnsi="Times New Roman" w:cs="Times New Roman"/>
+        </w:rPr>
+        <w:t>support</w:t>
+      </w:r>
+      <w:r>
+        <w:rPr>
+          <w:rFonts w:ascii="Times New Roman" w:hAnsi="Times New Roman" w:cs="Times New Roman"/>
+        </w:rPr>
+        <w:t xml:space="preserve"> this functionality.</w:t>
       </w:r>
     </w:p>
     <w:p>
@@ -4251,7 +4557,14 @@
         <w:rPr>
           <w:rFonts w:ascii="Times New Roman" w:hAnsi="Times New Roman" w:cs="Times New Roman"/>
         </w:rPr>
-        <w:t>my_</w:t>
+        <w:t>my_traceroute</w:t>
+      </w:r>
+      <w:proofErr w:type="spellEnd"/>
+      <w:r>
+        <w:rPr>
+          <w:rFonts w:ascii="Times New Roman" w:hAnsi="Times New Roman" w:cs="Times New Roman"/>
+        </w:rPr>
+        <w:t xml:space="preserve"> program has some limitations compared to the native </w:t>
       </w:r>
       <w:r>
         <w:rPr>
@@ -4259,12 +4572,11 @@
         </w:rPr>
         <w:t>traceroute</w:t>
       </w:r>
-      <w:proofErr w:type="spellEnd"/>
-      <w:r>
-        <w:rPr>
-          <w:rFonts w:ascii="Times New Roman" w:hAnsi="Times New Roman" w:cs="Times New Roman"/>
-        </w:rPr>
-        <w:t xml:space="preserve"> program has some limitations compared to the native ping utility. </w:t>
+      <w:r>
+        <w:rPr>
+          <w:rFonts w:ascii="Times New Roman" w:hAnsi="Times New Roman" w:cs="Times New Roman"/>
+        </w:rPr>
+        <w:t xml:space="preserve"> utility. </w:t>
       </w:r>
     </w:p>
     <w:p>
@@ -4291,7 +4603,55 @@
         <w:rPr>
           <w:rFonts w:ascii="Times New Roman" w:hAnsi="Times New Roman" w:cs="Times New Roman"/>
         </w:rPr>
-        <w:t>The hardcoded timeout is set at 3 seconds for probe, whereas in the native traceroute it is c</w:t>
+        <w:t xml:space="preserve">The hardcoded timeout </w:t>
+      </w:r>
+      <w:r>
+        <w:rPr>
+          <w:rFonts w:ascii="Times New Roman" w:hAnsi="Times New Roman" w:cs="Times New Roman"/>
+        </w:rPr>
+        <w:t>for</w:t>
+      </w:r>
+      <w:r>
+        <w:rPr>
+          <w:rFonts w:ascii="Times New Roman" w:hAnsi="Times New Roman" w:cs="Times New Roman"/>
+        </w:rPr>
+        <w:t xml:space="preserve"> </w:t>
+      </w:r>
+      <w:r>
+        <w:rPr>
+          <w:rFonts w:ascii="Times New Roman" w:hAnsi="Times New Roman" w:cs="Times New Roman"/>
+        </w:rPr>
+        <w:t>the</w:t>
+      </w:r>
+      <w:r>
+        <w:rPr>
+          <w:rFonts w:ascii="Times New Roman" w:hAnsi="Times New Roman" w:cs="Times New Roman"/>
+        </w:rPr>
+        <w:t xml:space="preserve"> </w:t>
+      </w:r>
+      <w:r>
+        <w:rPr>
+          <w:rFonts w:ascii="Times New Roman" w:hAnsi="Times New Roman" w:cs="Times New Roman"/>
+        </w:rPr>
+        <w:t>probe is</w:t>
+      </w:r>
+      <w:r>
+        <w:rPr>
+          <w:rFonts w:ascii="Times New Roman" w:hAnsi="Times New Roman" w:cs="Times New Roman"/>
+        </w:rPr>
+        <w:t xml:space="preserve"> 3 seconds, whereas in the native traceroute</w:t>
+      </w:r>
+      <w:r>
+        <w:rPr>
+          <w:rFonts w:ascii="Times New Roman" w:hAnsi="Times New Roman" w:cs="Times New Roman"/>
+        </w:rPr>
+        <w:t>,</w:t>
+      </w:r>
+      <w:r>
+        <w:rPr>
+          <w:rFonts w:ascii="Times New Roman" w:hAnsi="Times New Roman" w:cs="Times New Roman"/>
+        </w:rPr>
+        <w:t xml:space="preserve"> it is c</w:t>
       </w:r>
       <w:r>
         <w:rPr>
@@ -4334,103 +4694,119 @@
         <w:rPr>
           <w:rFonts w:ascii="Times New Roman" w:hAnsi="Times New Roman" w:cs="Times New Roman"/>
         </w:rPr>
-        <w:t xml:space="preserve">Native </w:t>
-      </w:r>
-      <w:r>
-        <w:rPr>
-          <w:rFonts w:ascii="Times New Roman" w:hAnsi="Times New Roman" w:cs="Times New Roman"/>
-        </w:rPr>
-        <w:t xml:space="preserve">traceroute also support flags to filter source addresses, destination ports, maximum TTL, TCP protocol, </w:t>
+        <w:t>Native traceroute also support</w:t>
+      </w:r>
+      <w:r>
+        <w:rPr>
+          <w:rFonts w:ascii="Times New Roman" w:hAnsi="Times New Roman" w:cs="Times New Roman"/>
+        </w:rPr>
+        <w:t>s</w:t>
+      </w:r>
+      <w:r>
+        <w:rPr>
+          <w:rFonts w:ascii="Times New Roman" w:hAnsi="Times New Roman" w:cs="Times New Roman"/>
+        </w:rPr>
+        <w:t xml:space="preserve"> flags to filter source addresses, destination ports, maximum TTL, TCP protocol, whereas </w:t>
       </w:r>
       <w:proofErr w:type="spellStart"/>
       <w:r>
         <w:rPr>
           <w:rFonts w:ascii="Times New Roman" w:hAnsi="Times New Roman" w:cs="Times New Roman"/>
         </w:rPr>
-        <w:t>where as</w:t>
+        <w:t>my_traceroute</w:t>
       </w:r>
       <w:proofErr w:type="spellEnd"/>
       <w:r>
         <w:rPr>
           <w:rFonts w:ascii="Times New Roman" w:hAnsi="Times New Roman" w:cs="Times New Roman"/>
         </w:rPr>
+        <w:t xml:space="preserve"> defaults to UDP probes.</w:t>
+      </w:r>
+    </w:p>
+    <w:p>
+      <w:pPr>
+        <w:jc w:val="both"/>
+        <w:rPr>
+          <w:rFonts w:ascii="Times New Roman" w:hAnsi="Times New Roman" w:cs="Times New Roman"/>
+        </w:rPr>
+      </w:pPr>
+    </w:p>
+    <w:p>
+      <w:pPr>
+        <w:pStyle w:val="Heading1"/>
+        <w:rPr>
+          <w:b/>
+          <w:bCs/>
+          <w:color w:val="2F5496" w:themeColor="accent1" w:themeShade="BF"/>
+        </w:rPr>
+      </w:pPr>
+      <w:r>
+        <w:rPr>
+          <w:b/>
+          <w:bCs/>
+          <w:color w:val="2F5496" w:themeColor="accent1" w:themeShade="BF"/>
+        </w:rPr>
+        <w:t>5. Conclusion</w:t>
+      </w:r>
+    </w:p>
+    <w:p>
+      <w:pPr>
+        <w:rPr>
+          <w:rFonts w:ascii="Times New Roman" w:hAnsi="Times New Roman" w:cs="Times New Roman"/>
+        </w:rPr>
+      </w:pPr>
+    </w:p>
+    <w:p>
+      <w:pPr>
+        <w:jc w:val="both"/>
+        <w:rPr>
+          <w:rFonts w:ascii="Times New Roman" w:hAnsi="Times New Roman" w:cs="Times New Roman"/>
+        </w:rPr>
+      </w:pPr>
+      <w:r>
+        <w:rPr>
+          <w:rFonts w:ascii="Times New Roman" w:hAnsi="Times New Roman" w:cs="Times New Roman"/>
+        </w:rPr>
+        <w:t xml:space="preserve">The </w:t>
+      </w:r>
+      <w:proofErr w:type="spellStart"/>
+      <w:r>
+        <w:rPr>
+          <w:rFonts w:ascii="Times New Roman" w:hAnsi="Times New Roman" w:cs="Times New Roman"/>
+        </w:rPr>
+        <w:t>my_</w:t>
+      </w:r>
+      <w:r>
+        <w:rPr>
+          <w:rFonts w:ascii="Times New Roman" w:hAnsi="Times New Roman" w:cs="Times New Roman"/>
+        </w:rPr>
+        <w:t>ping</w:t>
+      </w:r>
+      <w:proofErr w:type="spellEnd"/>
+      <w:r>
+        <w:rPr>
+          <w:rFonts w:ascii="Times New Roman" w:hAnsi="Times New Roman" w:cs="Times New Roman"/>
+        </w:rPr>
         <w:t xml:space="preserve"> </w:t>
       </w:r>
-      <w:proofErr w:type="spellStart"/>
-      <w:r>
-        <w:rPr>
-          <w:rFonts w:ascii="Times New Roman" w:hAnsi="Times New Roman" w:cs="Times New Roman"/>
-        </w:rPr>
-        <w:t>my_traceroute</w:t>
-      </w:r>
-      <w:proofErr w:type="spellEnd"/>
-      <w:r>
-        <w:rPr>
-          <w:rFonts w:ascii="Times New Roman" w:hAnsi="Times New Roman" w:cs="Times New Roman"/>
-        </w:rPr>
-        <w:t xml:space="preserve"> defaults to UDP probes.</w:t>
-      </w:r>
-    </w:p>
-    <w:p>
-      <w:pPr>
-        <w:jc w:val="both"/>
-        <w:rPr>
-          <w:rFonts w:ascii="Times New Roman" w:hAnsi="Times New Roman" w:cs="Times New Roman"/>
-        </w:rPr>
-      </w:pPr>
-    </w:p>
-    <w:p>
-      <w:pPr>
-        <w:pStyle w:val="Heading1"/>
-        <w:rPr>
-          <w:b/>
-          <w:bCs/>
-          <w:color w:val="2F5496" w:themeColor="accent1" w:themeShade="BF"/>
-        </w:rPr>
-      </w:pPr>
-      <w:r>
-        <w:rPr>
-          <w:b/>
-          <w:bCs/>
-          <w:color w:val="2F5496" w:themeColor="accent1" w:themeShade="BF"/>
-        </w:rPr>
-        <w:t>5. Conclusion</w:t>
-      </w:r>
-    </w:p>
-    <w:p>
-      <w:pPr>
-        <w:rPr>
-          <w:rFonts w:ascii="Times New Roman" w:hAnsi="Times New Roman" w:cs="Times New Roman"/>
-        </w:rPr>
-      </w:pPr>
-    </w:p>
-    <w:p>
-      <w:pPr>
-        <w:jc w:val="both"/>
-        <w:rPr>
-          <w:rFonts w:ascii="Times New Roman" w:hAnsi="Times New Roman" w:cs="Times New Roman"/>
-        </w:rPr>
-      </w:pPr>
-      <w:r>
-        <w:rPr>
-          <w:rFonts w:ascii="Times New Roman" w:hAnsi="Times New Roman" w:cs="Times New Roman"/>
-        </w:rPr>
-        <w:t xml:space="preserve">The </w:t>
-      </w:r>
-      <w:proofErr w:type="spellStart"/>
-      <w:r>
-        <w:rPr>
-          <w:rFonts w:ascii="Times New Roman" w:hAnsi="Times New Roman" w:cs="Times New Roman"/>
-        </w:rPr>
-        <w:t>my_</w:t>
-      </w:r>
-      <w:r>
-        <w:rPr>
-          <w:rFonts w:ascii="Times New Roman" w:hAnsi="Times New Roman" w:cs="Times New Roman"/>
-        </w:rPr>
-        <w:t>ping</w:t>
-      </w:r>
-      <w:proofErr w:type="spellEnd"/>
+      <w:r>
+        <w:rPr>
+          <w:rFonts w:ascii="Times New Roman" w:hAnsi="Times New Roman" w:cs="Times New Roman"/>
+        </w:rPr>
+        <w:t>program</w:t>
+      </w:r>
+      <w:r>
+        <w:rPr>
+          <w:rFonts w:ascii="Times New Roman" w:hAnsi="Times New Roman" w:cs="Times New Roman"/>
+        </w:rPr>
+        <w:t xml:space="preserve"> reports packet loss and round-trip times</w:t>
+      </w:r>
+      <w:r>
+        <w:rPr>
+          <w:rFonts w:ascii="Times New Roman" w:hAnsi="Times New Roman" w:cs="Times New Roman"/>
+        </w:rPr>
+        <w:t>. At</w:t>
+      </w:r>
       <w:r>
         <w:rPr>
           <w:rFonts w:ascii="Times New Roman" w:hAnsi="Times New Roman" w:cs="Times New Roman"/>
@@ -4441,13 +4817,13 @@
         <w:rPr>
           <w:rFonts w:ascii="Times New Roman" w:hAnsi="Times New Roman" w:cs="Times New Roman"/>
         </w:rPr>
-        <w:t>program</w:t>
-      </w:r>
-      <w:r>
-        <w:rPr>
-          <w:rFonts w:ascii="Times New Roman" w:hAnsi="Times New Roman" w:cs="Times New Roman"/>
-        </w:rPr>
-        <w:t xml:space="preserve"> reports packet loss and round-trip times, while the </w:t>
+        <w:t>the same time,</w:t>
+      </w:r>
+      <w:r>
+        <w:rPr>
+          <w:rFonts w:ascii="Times New Roman" w:hAnsi="Times New Roman" w:cs="Times New Roman"/>
+        </w:rPr>
+        <w:t xml:space="preserve"> the </w:t>
       </w:r>
       <w:proofErr w:type="spellStart"/>
       <w:r>

</xml_diff>

<commit_message>
Removed few Unnecesary files
</commit_message>
<xml_diff>
--- a/ping_and_traceroute_report.docx
+++ b/ping_and_traceroute_report.docx
@@ -1131,13 +1131,6 @@
           <w:bCs/>
         </w:rPr>
         <w:t>2.3 -</w:t>
-      </w:r>
-      <w:r>
-        <w:rPr>
-          <w:b/>
-          <w:bCs/>
-        </w:rPr>
-        <w:t xml:space="preserve">The </w:t>
       </w:r>
       <w:r>
         <w:rPr>

</xml_diff>